<commit_message>
Importers agree on desktop and phone across a real 56-book corpus; skip credit lines from reading on request, duplicate check at preview, titles and author carried over
Co-Authored-By: Claude Opus 5.5 <noreply@anthropic.com>
</commit_message>
<xml_diff>
--- a/_internal/tests/fixtures/import/headings.docx
+++ b/_internal/tests/fixtures/import/headings.docx
@@ -14,6 +14,48 @@
       <w:r>
         <w:t xml:space="preserve">Một câu đề tặng đứng trước chương đầu tiên.</w:t>
       </w:r>
+    </w:p>
+    <w:p>
+      <w:pPr>
+        <w:pStyle w:val="TOC1"/>
+      </w:pPr>
+      <w:hyperlink w:anchor="_Toc1">
+        <w:r>
+          <w:t>Chương 1: Bến phà lúc bình minh</w:t>
+        </w:r>
+        <w:r>
+          <w:tab/>
+          <w:t>3</w:t>
+        </w:r>
+      </w:hyperlink>
+    </w:p>
+    <w:p>
+      <w:pPr>
+        <w:pStyle w:val="TOC1"/>
+      </w:pPr>
+      <w:hyperlink w:anchor="_Toc2">
+        <w:r>
+          <w:t>Chương 2: Người khách lạ</w:t>
+        </w:r>
+        <w:r>
+          <w:tab/>
+          <w:t>4</w:t>
+        </w:r>
+      </w:hyperlink>
+    </w:p>
+    <w:p>
+      <w:pPr>
+        <w:pStyle w:val="TOC1"/>
+      </w:pPr>
+      <w:hyperlink w:anchor="_Toc3">
+        <w:r>
+          <w:t>Chương 3: Cơn mưa cuối mùa</w:t>
+        </w:r>
+        <w:r>
+          <w:tab/>
+          <w:t>5</w:t>
+        </w:r>
+      </w:hyperlink>
     </w:p>
     <w:p>
       <w:pPr>
@@ -141,5 +183,8 @@
   <w:style w:type="paragraph" w:styleId="Tieude1">
     <w:name w:val="heading 1"/>
   </w:style>
+  <w:style w:type="paragraph" w:styleId="TOC1">
+    <w:name w:val="toc 1"/>
+  </w:style>
 </w:styles>
 </file>
</xml_diff>

<commit_message>
Import: join Word lines that a hard break split mid-sentence
Text pasted into Word from the web or a PDF ends each visual line with
Shift+Enter, so one sentence became two paragraphs and the voice paused
mid-sentence. A break now joins when the line before has not ended a
sentence and the next line starts lower-case; verse and dialogue lines
stay apart. Same rule in the desktop and Android importers, checked by
the shared fixture.

Co-Authored-By: Claude Opus 5.5 <noreply@anthropic.com>
</commit_message>
<xml_diff>
--- a/_internal/tests/fixtures/import/headings.docx
+++ b/_internal/tests/fixtures/import/headings.docx
@@ -77,6 +77,12 @@
         <w:t>có tab</w:t>
         <w:br/>
         <w:t>và xuống dòng cứng.</w:t>
+        <w:br/>
+        <w:t>Dòng thơ viết hoa</w:t>
+        <w:br/>
+        <w:t>Không nối vào dòng trên</w:t>
+        <w:br/>
+        <w:t>- câu thoại riêng.</w:t>
       </w:r>
     </w:p>
     <w:p>

</xml_diff>